<commit_message>
feat(docgen): شخص واحد قرار template edit -- signature on each page, logo header, address footer
Co-Authored-By: Claude Opus 5.5 <noreply@anthropic.com>
</commit_message>
<xml_diff>
--- a/src/legal_assistant/docgen/templates/files/قرار_تعديل_شركة_شخص_واحد_template.docx
+++ b/src/legal_assistant/docgen/templates/files/قرار_تعديل_شركة_شخص_واحد_template.docx
@@ -70,10 +70,541 @@
       <w:pPr>
         <w:bidi/>
         <w:spacing w:after="300" w:line="300" w:lineRule="auto"/>
+      </w:pPr>
+      <w:r>
+        <w:t xml:space="preserve">قرار مالك الشركة بتعديل </w:t>
+      </w:r>
+      <w:proofErr w:type="gramStart"/>
+      <w:r>
+        <w:t xml:space="preserve">{{ </w:t>
+      </w:r>
+      <w:proofErr w:type="spellStart"/>
+      <w:r>
+        <w:t>articles</w:t>
+      </w:r>
+      <w:proofErr w:type="gramEnd"/>
+      <w:r>
+        <w:t>_</w:t>
+      </w:r>
+      <w:proofErr w:type="gramStart"/>
+      <w:r>
+        <w:t>title</w:t>
+      </w:r>
+      <w:proofErr w:type="spellEnd"/>
+      <w:r>
+        <w:t xml:space="preserve"> }</w:t>
+      </w:r>
+      <w:proofErr w:type="gramEnd"/>
+      <w:r>
+        <w:t xml:space="preserve">} من النظام </w:t>
+      </w:r>
+      <w:proofErr w:type="spellStart"/>
+      <w:r>
+        <w:t>الاساسى</w:t>
+      </w:r>
+      <w:proofErr w:type="spellEnd"/>
+      <w:r>
+        <w:t xml:space="preserve"> لشركة </w:t>
+      </w:r>
+      <w:proofErr w:type="gramStart"/>
+      <w:r>
+        <w:t xml:space="preserve">{{ </w:t>
+      </w:r>
+      <w:proofErr w:type="spellStart"/>
+      <w:r>
+        <w:t>company</w:t>
+      </w:r>
+      <w:proofErr w:type="gramEnd"/>
+      <w:r>
+        <w:t>_</w:t>
+      </w:r>
+      <w:proofErr w:type="gramStart"/>
+      <w:r>
+        <w:t>name</w:t>
+      </w:r>
+      <w:proofErr w:type="spellEnd"/>
+      <w:r>
+        <w:t xml:space="preserve"> }</w:t>
+      </w:r>
+      <w:proofErr w:type="gramEnd"/>
+      <w:r>
+        <w:t xml:space="preserve">} والمؤسسة طبقا لأحكام القانون رقم </w:t>
+      </w:r>
+      <w:proofErr w:type="gramStart"/>
+      <w:r>
+        <w:t xml:space="preserve">{{ </w:t>
+      </w:r>
+      <w:proofErr w:type="spellStart"/>
+      <w:r>
+        <w:t>law</w:t>
+      </w:r>
+      <w:proofErr w:type="gramEnd"/>
+      <w:r>
+        <w:t>_</w:t>
+      </w:r>
+      <w:proofErr w:type="gramStart"/>
+      <w:r>
+        <w:t>number</w:t>
+      </w:r>
+      <w:proofErr w:type="spellEnd"/>
+      <w:r>
+        <w:t xml:space="preserve"> }</w:t>
+      </w:r>
+      <w:proofErr w:type="gramEnd"/>
+      <w:r>
+        <w:t xml:space="preserve">} لسنة </w:t>
+      </w:r>
+      <w:proofErr w:type="gramStart"/>
+      <w:r>
+        <w:t xml:space="preserve">{{ </w:t>
+      </w:r>
+      <w:proofErr w:type="spellStart"/>
+      <w:r>
+        <w:t>law</w:t>
+      </w:r>
+      <w:proofErr w:type="gramEnd"/>
+      <w:r>
+        <w:t>_</w:t>
+      </w:r>
+      <w:proofErr w:type="gramStart"/>
+      <w:r>
+        <w:t>year</w:t>
+      </w:r>
+      <w:proofErr w:type="spellEnd"/>
+      <w:r>
+        <w:t xml:space="preserve"> }</w:t>
+      </w:r>
+      <w:proofErr w:type="gramEnd"/>
+      <w:r>
+        <w:t xml:space="preserve">} والمقيدة بالسجل التجاري رقم </w:t>
+      </w:r>
+      <w:proofErr w:type="gramStart"/>
+      <w:r>
+        <w:t xml:space="preserve">{{ </w:t>
+      </w:r>
+      <w:proofErr w:type="spellStart"/>
+      <w:r>
+        <w:t>commercial</w:t>
+      </w:r>
+      <w:proofErr w:type="gramEnd"/>
+      <w:r>
+        <w:t>_registration_</w:t>
+      </w:r>
+      <w:proofErr w:type="gramStart"/>
+      <w:r>
+        <w:t>no</w:t>
+      </w:r>
+      <w:proofErr w:type="spellEnd"/>
+      <w:r>
+        <w:t xml:space="preserve"> }</w:t>
+      </w:r>
+      <w:proofErr w:type="gramEnd"/>
+      <w:r>
+        <w:t>}.</w:t>
+      </w:r>
+    </w:p>
+    <w:p>
+      <w:pPr>
+        <w:bidi/>
+        <w:spacing w:after="300" w:line="300" w:lineRule="auto"/>
+      </w:pPr>
+      <w:r>
+        <w:rPr>
+          <w:rFonts w:hint="cs"/>
+        </w:rPr>
+        <w:t xml:space="preserve">اولا: </w:t>
+      </w:r>
+      <w:r>
+        <w:t xml:space="preserve">انه </w:t>
+      </w:r>
+      <w:proofErr w:type="spellStart"/>
+      <w:r>
+        <w:t>فى</w:t>
+      </w:r>
+      <w:proofErr w:type="spellEnd"/>
+      <w:r>
+        <w:t xml:space="preserve"> يوم </w:t>
+      </w:r>
+      <w:proofErr w:type="gramStart"/>
+      <w:r>
+        <w:t xml:space="preserve">{{ </w:t>
+      </w:r>
+      <w:proofErr w:type="spellStart"/>
+      <w:r>
+        <w:t>day</w:t>
+      </w:r>
+      <w:proofErr w:type="gramEnd"/>
+      <w:r>
+        <w:t>_</w:t>
+      </w:r>
+      <w:proofErr w:type="gramStart"/>
+      <w:r>
+        <w:t>name</w:t>
+      </w:r>
+      <w:proofErr w:type="spellEnd"/>
+      <w:r>
+        <w:t xml:space="preserve"> }</w:t>
+      </w:r>
+      <w:proofErr w:type="gramEnd"/>
+      <w:r>
+        <w:t xml:space="preserve">} الموافق </w:t>
+      </w:r>
+      <w:proofErr w:type="gramStart"/>
+      <w:r>
+        <w:t xml:space="preserve">{{ </w:t>
+      </w:r>
+      <w:proofErr w:type="spellStart"/>
+      <w:r>
+        <w:t>day</w:t>
+      </w:r>
+      <w:proofErr w:type="gramEnd"/>
+      <w:r>
+        <w:t>_</w:t>
+      </w:r>
+      <w:proofErr w:type="gramStart"/>
+      <w:r>
+        <w:t>date</w:t>
+      </w:r>
+      <w:proofErr w:type="spellEnd"/>
+      <w:r>
+        <w:t xml:space="preserve"> }</w:t>
+      </w:r>
+      <w:proofErr w:type="gramEnd"/>
+      <w:r>
+        <w:t xml:space="preserve">} قررنا نحن السيد </w:t>
+      </w:r>
+      <w:proofErr w:type="gramStart"/>
+      <w:r>
+        <w:t xml:space="preserve">{{ </w:t>
+      </w:r>
+      <w:proofErr w:type="spellStart"/>
+      <w:r>
+        <w:t>owner</w:t>
+      </w:r>
+      <w:proofErr w:type="gramEnd"/>
+      <w:r>
+        <w:t>_</w:t>
+      </w:r>
+      <w:proofErr w:type="gramStart"/>
+      <w:r>
+        <w:t>name</w:t>
+      </w:r>
+      <w:proofErr w:type="spellEnd"/>
+      <w:r>
+        <w:t xml:space="preserve"> }</w:t>
+      </w:r>
+      <w:proofErr w:type="gramEnd"/>
+      <w:r>
+        <w:t xml:space="preserve">} مالك شركة </w:t>
+      </w:r>
+      <w:proofErr w:type="gramStart"/>
+      <w:r>
+        <w:t xml:space="preserve">{{ </w:t>
+      </w:r>
+      <w:proofErr w:type="spellStart"/>
+      <w:r>
+        <w:t>company</w:t>
+      </w:r>
+      <w:proofErr w:type="gramEnd"/>
+      <w:r>
+        <w:t>_</w:t>
+      </w:r>
+      <w:proofErr w:type="gramStart"/>
+      <w:r>
+        <w:t>name</w:t>
+      </w:r>
+      <w:proofErr w:type="spellEnd"/>
+      <w:r>
+        <w:t xml:space="preserve"> }</w:t>
+      </w:r>
+      <w:proofErr w:type="gramEnd"/>
+      <w:r>
+        <w:t xml:space="preserve">} شركة شخص واحد والمؤسسة طبقا لأحكام القانون رقم </w:t>
+      </w:r>
+      <w:proofErr w:type="gramStart"/>
+      <w:r>
+        <w:t xml:space="preserve">{{ </w:t>
+      </w:r>
+      <w:proofErr w:type="spellStart"/>
+      <w:r>
+        <w:t>law</w:t>
+      </w:r>
+      <w:proofErr w:type="gramEnd"/>
+      <w:r>
+        <w:t>_</w:t>
+      </w:r>
+      <w:proofErr w:type="gramStart"/>
+      <w:r>
+        <w:t>number</w:t>
+      </w:r>
+      <w:proofErr w:type="spellEnd"/>
+      <w:r>
+        <w:t xml:space="preserve"> }</w:t>
+      </w:r>
+      <w:proofErr w:type="gramEnd"/>
+      <w:r>
+        <w:t xml:space="preserve">} لسنة </w:t>
+      </w:r>
+      <w:proofErr w:type="gramStart"/>
+      <w:r>
+        <w:t xml:space="preserve">{{ </w:t>
+      </w:r>
+      <w:proofErr w:type="spellStart"/>
+      <w:r>
+        <w:t>law</w:t>
+      </w:r>
+      <w:proofErr w:type="gramEnd"/>
+      <w:r>
+        <w:t>_</w:t>
+      </w:r>
+      <w:proofErr w:type="gramStart"/>
+      <w:r>
+        <w:t>year</w:t>
+      </w:r>
+      <w:proofErr w:type="spellEnd"/>
+      <w:r>
+        <w:t xml:space="preserve"> }</w:t>
+      </w:r>
+      <w:proofErr w:type="gramEnd"/>
+      <w:r>
+        <w:t xml:space="preserve">} والمقيدة بالسجل التجاري رقم </w:t>
+      </w:r>
+      <w:proofErr w:type="gramStart"/>
+      <w:r>
+        <w:t xml:space="preserve">{{ </w:t>
+      </w:r>
+      <w:proofErr w:type="spellStart"/>
+      <w:r>
+        <w:t>commercial</w:t>
+      </w:r>
+      <w:proofErr w:type="gramEnd"/>
+      <w:r>
+        <w:t>_registration_</w:t>
+      </w:r>
+      <w:proofErr w:type="gramStart"/>
+      <w:r>
+        <w:t>no</w:t>
+      </w:r>
+      <w:proofErr w:type="spellEnd"/>
+      <w:r>
+        <w:t xml:space="preserve"> }</w:t>
+      </w:r>
+      <w:proofErr w:type="gramEnd"/>
+      <w:r>
+        <w:t xml:space="preserve">} بتاريخ </w:t>
+      </w:r>
+      <w:proofErr w:type="gramStart"/>
+      <w:r>
+        <w:t xml:space="preserve">{{ </w:t>
+      </w:r>
+      <w:proofErr w:type="spellStart"/>
+      <w:r>
+        <w:t>commercial</w:t>
+      </w:r>
+      <w:proofErr w:type="gramEnd"/>
+      <w:r>
+        <w:t>_registration_</w:t>
+      </w:r>
+      <w:proofErr w:type="gramStart"/>
+      <w:r>
+        <w:t>date</w:t>
+      </w:r>
+      <w:proofErr w:type="spellEnd"/>
+      <w:r>
+        <w:t xml:space="preserve"> }</w:t>
+      </w:r>
+      <w:proofErr w:type="gramEnd"/>
+      <w:r>
+        <w:t>}</w:t>
+      </w:r>
+    </w:p>
+    <w:p>
+      <w:pPr>
+        <w:bidi/>
+        <w:spacing w:after="300" w:line="300" w:lineRule="auto"/>
+        <w:jc w:val="center"/>
+      </w:pPr>
+      <w:proofErr w:type="spellStart"/>
+      <w:r>
+        <w:t>الاتى</w:t>
+      </w:r>
+      <w:proofErr w:type="spellEnd"/>
+      <w:r>
+        <w:t>:</w:t>
+      </w:r>
+    </w:p>
+    <w:p>
+      <w:r>
+        <w:t xml:space="preserve">{%p </w:t>
+      </w:r>
+      <w:proofErr w:type="spellStart"/>
+      <w:r>
+        <w:t>for</w:t>
+      </w:r>
+      <w:proofErr w:type="spellEnd"/>
+      <w:r>
+        <w:t xml:space="preserve"> a </w:t>
+      </w:r>
+      <w:proofErr w:type="spellStart"/>
+      <w:r>
+        <w:t>in</w:t>
+      </w:r>
+      <w:proofErr w:type="spellEnd"/>
+      <w:r>
+        <w:t xml:space="preserve"> </w:t>
+      </w:r>
+      <w:proofErr w:type="spellStart"/>
+      <w:r>
+        <w:t>articles</w:t>
+      </w:r>
+      <w:proofErr w:type="spellEnd"/>
+      <w:r>
+        <w:t xml:space="preserve"> %}</w:t>
+      </w:r>
+    </w:p>
+    <w:p>
+      <w:pPr>
+        <w:bidi/>
+        <w:spacing w:after="240" w:line="300" w:lineRule="auto"/>
         <w:jc w:val="both"/>
       </w:pPr>
       <w:r>
-        <w:t>قرار مالك الشركة بتعديل {{ articles_title }} من النظام الاساسى لشركة {{ company_name }} شركة شخص واحد والمؤسسة طبقا لأحكام القانون رقم {{ law_number }} لسنة {{ law_year }} والمقيدة بالسجل التجاري رقم {{ commercial_registration_no }}.</w:t>
+        <w:rPr>
+          <w:b/>
+          <w:bCs/>
+        </w:rPr>
+        <w:t xml:space="preserve">تعديل </w:t>
+      </w:r>
+      <w:proofErr w:type="gramStart"/>
+      <w:r>
+        <w:rPr>
+          <w:b/>
+          <w:bCs/>
+        </w:rPr>
+        <w:t xml:space="preserve">{{ </w:t>
+      </w:r>
+      <w:proofErr w:type="spellStart"/>
+      <w:r>
+        <w:rPr>
+          <w:b/>
+          <w:bCs/>
+        </w:rPr>
+        <w:t>a</w:t>
+      </w:r>
+      <w:proofErr w:type="gramEnd"/>
+      <w:r>
+        <w:rPr>
+          <w:b/>
+          <w:bCs/>
+        </w:rPr>
+        <w:t>.article_</w:t>
+      </w:r>
+      <w:proofErr w:type="gramStart"/>
+      <w:r>
+        <w:rPr>
+          <w:b/>
+          <w:bCs/>
+        </w:rPr>
+        <w:t>name</w:t>
+      </w:r>
+      <w:proofErr w:type="spellEnd"/>
+      <w:r>
+        <w:rPr>
+          <w:b/>
+          <w:bCs/>
+        </w:rPr>
+        <w:t xml:space="preserve"> }</w:t>
+      </w:r>
+      <w:proofErr w:type="gramEnd"/>
+      <w:r>
+        <w:rPr>
+          <w:b/>
+          <w:bCs/>
+        </w:rPr>
+        <w:t xml:space="preserve">} من النظام </w:t>
+      </w:r>
+      <w:proofErr w:type="spellStart"/>
+      <w:r>
+        <w:rPr>
+          <w:b/>
+          <w:bCs/>
+        </w:rPr>
+        <w:t>الاساسى</w:t>
+      </w:r>
+      <w:proofErr w:type="spellEnd"/>
+      <w:r>
+        <w:rPr>
+          <w:b/>
+          <w:bCs/>
+        </w:rPr>
+        <w:t xml:space="preserve"> للشركة</w:t>
+      </w:r>
+    </w:p>
+    <w:p>
+      <w:pPr>
+        <w:bidi/>
+        <w:spacing w:after="200" w:line="300" w:lineRule="auto"/>
+        <w:jc w:val="both"/>
+      </w:pPr>
+      <w:proofErr w:type="gramStart"/>
+      <w:r>
+        <w:rPr>
+          <w:b/>
+          <w:bCs/>
+          <w:sz w:val="20"/>
+          <w:szCs w:val="20"/>
+        </w:rPr>
+        <w:t xml:space="preserve">{{ </w:t>
+      </w:r>
+      <w:proofErr w:type="spellStart"/>
+      <w:r>
+        <w:rPr>
+          <w:b/>
+          <w:bCs/>
+          <w:sz w:val="20"/>
+          <w:szCs w:val="20"/>
+        </w:rPr>
+        <w:t>a</w:t>
+      </w:r>
+      <w:proofErr w:type="gramEnd"/>
+      <w:r>
+        <w:rPr>
+          <w:b/>
+          <w:bCs/>
+          <w:sz w:val="20"/>
+          <w:szCs w:val="20"/>
+        </w:rPr>
+        <w:t>.article_</w:t>
+      </w:r>
+      <w:proofErr w:type="gramStart"/>
+      <w:r>
+        <w:rPr>
+          <w:b/>
+          <w:bCs/>
+          <w:sz w:val="20"/>
+          <w:szCs w:val="20"/>
+        </w:rPr>
+        <w:t>name</w:t>
+      </w:r>
+      <w:proofErr w:type="spellEnd"/>
+      <w:r>
+        <w:rPr>
+          <w:b/>
+          <w:bCs/>
+          <w:sz w:val="20"/>
+          <w:szCs w:val="20"/>
+        </w:rPr>
+        <w:t xml:space="preserve"> }</w:t>
+      </w:r>
+      <w:proofErr w:type="gramEnd"/>
+      <w:r>
+        <w:rPr>
+          <w:b/>
+          <w:bCs/>
+          <w:sz w:val="20"/>
+          <w:szCs w:val="20"/>
+        </w:rPr>
+        <w:t>} قبل التعديل:</w:t>
       </w:r>
     </w:p>
     <w:p>
@@ -82,43 +613,53 @@
         <w:spacing w:after="300" w:line="300" w:lineRule="auto"/>
         <w:jc w:val="both"/>
       </w:pPr>
-      <w:r>
-        <w:rPr>
-          <w:rFonts w:hint="cs"/>
-        </w:rPr>
-        <w:t xml:space="preserve">اولا: </w:t>
-      </w:r>
-      <w:r>
-        <w:t>انه فى يوم {{ day_name }} الموافق {{ day_date }} قررنا نحن السيد {{ owner_name }} مالك شركة {{ company_name }} شركة شخص واحد والمؤسسة طبقا لأحكام القانون رقم {{ law_number }} لسنة {{ law_year }} والمقيدة بالسجل التجاري رقم {{ commercial_registration_no }} بتاريخ {{ commercial_registration_date }}</w:t>
-      </w:r>
-    </w:p>
-    <w:p>
-      <w:pPr>
-        <w:bidi/>
-        <w:spacing w:after="300" w:line="300" w:lineRule="auto"/>
-        <w:jc w:val="center"/>
-      </w:pPr>
-      <w:r>
-        <w:t>الاتى:</w:t>
-      </w:r>
-    </w:p>
-    <w:p>
-      <w:r>
-        <w:t>{%p for a in articles %}</w:t>
-      </w:r>
-    </w:p>
-    <w:p>
-      <w:pPr>
-        <w:bidi/>
-        <w:spacing w:after="240" w:line="300" w:lineRule="auto"/>
-        <w:jc w:val="both"/>
-      </w:pPr>
-      <w:r>
-        <w:rPr>
-          <w:b/>
-          <w:bCs/>
-        </w:rPr>
-        <w:t>تعديل {{ a.article_name }} من النظام الاساسى للشركة</w:t>
+      <w:proofErr w:type="gramStart"/>
+      <w:r>
+        <w:rPr>
+          <w:sz w:val="20"/>
+          <w:szCs w:val="20"/>
+        </w:rPr>
+        <w:t xml:space="preserve">{{ </w:t>
+      </w:r>
+      <w:proofErr w:type="spellStart"/>
+      <w:r>
+        <w:rPr>
+          <w:sz w:val="20"/>
+          <w:szCs w:val="20"/>
+        </w:rPr>
+        <w:t>a</w:t>
+      </w:r>
+      <w:proofErr w:type="gramEnd"/>
+      <w:r>
+        <w:rPr>
+          <w:sz w:val="20"/>
+          <w:szCs w:val="20"/>
+        </w:rPr>
+        <w:t>.article_original_</w:t>
+      </w:r>
+      <w:proofErr w:type="gramStart"/>
+      <w:r>
+        <w:rPr>
+          <w:sz w:val="20"/>
+          <w:szCs w:val="20"/>
+        </w:rPr>
+        <w:t>content</w:t>
+      </w:r>
+      <w:proofErr w:type="spellEnd"/>
+      <w:r>
+        <w:rPr>
+          <w:sz w:val="20"/>
+          <w:szCs w:val="20"/>
+        </w:rPr>
+        <w:t xml:space="preserve"> }</w:t>
+      </w:r>
+      <w:proofErr w:type="gramEnd"/>
+      <w:r>
+        <w:rPr>
+          <w:sz w:val="20"/>
+          <w:szCs w:val="20"/>
+        </w:rPr>
+        <w:t>}</w:t>
       </w:r>
     </w:p>
     <w:p>
@@ -127,28 +668,65 @@
         <w:spacing w:after="200" w:line="300" w:lineRule="auto"/>
         <w:jc w:val="both"/>
       </w:pPr>
-      <w:r>
-        <w:rPr>
-          <w:b/>
-          <w:bCs/>
-          <w:sz w:val="20"/>
-          <w:szCs w:val="20"/>
-        </w:rPr>
-        <w:t>{{ a.article_name }} قبل التعديل:</w:t>
-      </w:r>
-    </w:p>
-    <w:p>
-      <w:pPr>
-        <w:bidi/>
-        <w:spacing w:after="300" w:line="300" w:lineRule="auto"/>
-        <w:jc w:val="both"/>
-      </w:pPr>
-      <w:r>
-        <w:rPr>
-          <w:sz w:val="20"/>
-          <w:szCs w:val="20"/>
-        </w:rPr>
-        <w:t>{{ a.article_original_content }}</w:t>
+      <w:proofErr w:type="gramStart"/>
+      <w:r>
+        <w:rPr>
+          <w:b/>
+          <w:bCs/>
+          <w:sz w:val="20"/>
+          <w:szCs w:val="20"/>
+        </w:rPr>
+        <w:t xml:space="preserve">{{ </w:t>
+      </w:r>
+      <w:proofErr w:type="spellStart"/>
+      <w:r>
+        <w:rPr>
+          <w:b/>
+          <w:bCs/>
+          <w:sz w:val="20"/>
+          <w:szCs w:val="20"/>
+        </w:rPr>
+        <w:t>a</w:t>
+      </w:r>
+      <w:proofErr w:type="gramEnd"/>
+      <w:r>
+        <w:rPr>
+          <w:b/>
+          <w:bCs/>
+          <w:sz w:val="20"/>
+          <w:szCs w:val="20"/>
+        </w:rPr>
+        <w:t>.article_</w:t>
+      </w:r>
+      <w:proofErr w:type="gramStart"/>
+      <w:r>
+        <w:rPr>
+          <w:b/>
+          <w:bCs/>
+          <w:sz w:val="20"/>
+          <w:szCs w:val="20"/>
+        </w:rPr>
+        <w:t>name</w:t>
+      </w:r>
+      <w:proofErr w:type="spellEnd"/>
+      <w:r>
+        <w:rPr>
+          <w:b/>
+          <w:bCs/>
+          <w:sz w:val="20"/>
+          <w:szCs w:val="20"/>
+        </w:rPr>
+        <w:t xml:space="preserve"> }</w:t>
+      </w:r>
+      <w:proofErr w:type="gramEnd"/>
+      <w:r>
+        <w:rPr>
+          <w:b/>
+          <w:bCs/>
+          <w:sz w:val="20"/>
+          <w:szCs w:val="20"/>
+        </w:rPr>
+        <w:t>} بعد التعديل:</w:t>
       </w:r>
     </w:p>
     <w:p>
@@ -157,14 +735,53 @@
         <w:spacing w:after="200" w:line="300" w:lineRule="auto"/>
         <w:jc w:val="both"/>
       </w:pPr>
-      <w:r>
-        <w:rPr>
-          <w:b/>
-          <w:bCs/>
-          <w:sz w:val="20"/>
-          <w:szCs w:val="20"/>
-        </w:rPr>
-        <w:t>{{ a.article_name }} بعد التعديل:</w:t>
+      <w:proofErr w:type="gramStart"/>
+      <w:r>
+        <w:rPr>
+          <w:sz w:val="20"/>
+          <w:szCs w:val="20"/>
+        </w:rPr>
+        <w:t xml:space="preserve">{{ </w:t>
+      </w:r>
+      <w:proofErr w:type="spellStart"/>
+      <w:r>
+        <w:rPr>
+          <w:sz w:val="20"/>
+          <w:szCs w:val="20"/>
+        </w:rPr>
+        <w:t>a</w:t>
+      </w:r>
+      <w:proofErr w:type="gramEnd"/>
+      <w:r>
+        <w:rPr>
+          <w:sz w:val="20"/>
+          <w:szCs w:val="20"/>
+        </w:rPr>
+        <w:t>.article_new_</w:t>
+      </w:r>
+      <w:proofErr w:type="gramStart"/>
+      <w:r>
+        <w:rPr>
+          <w:sz w:val="20"/>
+          <w:szCs w:val="20"/>
+        </w:rPr>
+        <w:t>content</w:t>
+      </w:r>
+      <w:proofErr w:type="spellEnd"/>
+      <w:r>
+        <w:rPr>
+          <w:sz w:val="20"/>
+          <w:szCs w:val="20"/>
+        </w:rPr>
+        <w:t xml:space="preserve"> }</w:t>
+      </w:r>
+      <w:proofErr w:type="gramEnd"/>
+      <w:r>
+        <w:rPr>
+          <w:sz w:val="20"/>
+          <w:szCs w:val="20"/>
+        </w:rPr>
+        <w:t>}</w:t>
       </w:r>
     </w:p>
     <w:p>
@@ -174,21 +791,15 @@
         <w:jc w:val="both"/>
       </w:pPr>
       <w:r>
-        <w:rPr>
-          <w:sz w:val="20"/>
-          <w:szCs w:val="20"/>
-        </w:rPr>
-        <w:t>{{ a.article_new_content }}</w:t>
-      </w:r>
-    </w:p>
-    <w:p>
-      <w:pPr>
-        <w:bidi/>
-        <w:spacing w:after="200" w:line="300" w:lineRule="auto"/>
-        <w:jc w:val="both"/>
-      </w:pPr>
-      <w:r>
-        <w:t>{%p endfor %}</w:t>
+        <w:t xml:space="preserve">{%p </w:t>
+      </w:r>
+      <w:proofErr w:type="spellStart"/>
+      <w:r>
+        <w:t>endfor</w:t>
+      </w:r>
+      <w:proofErr w:type="spellEnd"/>
+      <w:r>
+        <w:t xml:space="preserve"> %}</w:t>
       </w:r>
     </w:p>
     <w:p>
@@ -286,17 +897,63 @@
       <w:pPr>
         <w:bidi/>
         <w:spacing w:after="300" w:line="300" w:lineRule="auto"/>
-        <w:jc w:val="both"/>
-      </w:pPr>
-      <w:r>
-        <w:t>ثانيا: يعمل بهذا القرار فور اتمام الاجراءات القانونية المنصوص عليها بالقانون رقم {{ law_number }} لسنة {{ law_year }} ولائحته التنفيذية وتعديلاتها بالهيئة العامة للاستثمار والمناطق الحرة.</w:t>
+      </w:pPr>
+      <w:r>
+        <w:t xml:space="preserve">ثانيا: يعمل بهذا القرار فور اتمام الاجراءات القانونية المنصوص عليها بالقانون رقم </w:t>
+      </w:r>
+      <w:proofErr w:type="gramStart"/>
+      <w:r>
+        <w:t xml:space="preserve">{{ </w:t>
+      </w:r>
+      <w:proofErr w:type="spellStart"/>
+      <w:r>
+        <w:t>law</w:t>
+      </w:r>
+      <w:proofErr w:type="gramEnd"/>
+      <w:r>
+        <w:t>_</w:t>
+      </w:r>
+      <w:proofErr w:type="gramStart"/>
+      <w:r>
+        <w:t>number</w:t>
+      </w:r>
+      <w:proofErr w:type="spellEnd"/>
+      <w:r>
+        <w:t xml:space="preserve"> }</w:t>
+      </w:r>
+      <w:proofErr w:type="gramEnd"/>
+      <w:r>
+        <w:t xml:space="preserve">} لسنة </w:t>
+      </w:r>
+      <w:proofErr w:type="gramStart"/>
+      <w:r>
+        <w:t xml:space="preserve">{{ </w:t>
+      </w:r>
+      <w:proofErr w:type="spellStart"/>
+      <w:r>
+        <w:t>law</w:t>
+      </w:r>
+      <w:proofErr w:type="gramEnd"/>
+      <w:r>
+        <w:t>_</w:t>
+      </w:r>
+      <w:proofErr w:type="gramStart"/>
+      <w:r>
+        <w:t>year</w:t>
+      </w:r>
+      <w:proofErr w:type="spellEnd"/>
+      <w:r>
+        <w:t xml:space="preserve"> }</w:t>
+      </w:r>
+      <w:proofErr w:type="gramEnd"/>
+      <w:r>
+        <w:t>} ولائحته التنفيذية وتعديلاتها بالهيئة العامة للاستثمار والمناطق الحرة.</w:t>
       </w:r>
     </w:p>
     <w:p>
       <w:pPr>
         <w:bidi/>
         <w:spacing w:after="300" w:line="300" w:lineRule="auto"/>
-        <w:jc w:val="both"/>
       </w:pPr>
       <w:r>
         <w:t>ثالثا: تفويض كلا من الساد</w:t>
@@ -309,21 +966,188 @@
         <w:t>ة</w:t>
       </w:r>
       <w:r>
-        <w:t>/ {{ names_of_commissioners }} (منفردين او مجتمعين) وذلك في اعتماد وتوثيق عقد وقرار التعديل في هيئة الاستثمار والتوقيع والتصديق في مكتب الشهر العقاري والتعامل مع السجل التجاري والتوقيع على العقد امام الشهر العقاري والغرفة التجارية ومصلحة الضرائب المصرية العامة وجميع الجهات الحكومية وغير الحكومية ولهم حق تفويض وتوكيل الأخرين في كل او بعض ما ذكر.</w:t>
+        <w:t xml:space="preserve">/ </w:t>
+      </w:r>
+      <w:proofErr w:type="gramStart"/>
+      <w:r>
+        <w:t xml:space="preserve">{{ </w:t>
+      </w:r>
+      <w:proofErr w:type="spellStart"/>
+      <w:r>
+        <w:t>names</w:t>
+      </w:r>
+      <w:proofErr w:type="gramEnd"/>
+      <w:r>
+        <w:t>_of_</w:t>
+      </w:r>
+      <w:proofErr w:type="gramStart"/>
+      <w:r>
+        <w:t>commissioners</w:t>
+      </w:r>
+      <w:proofErr w:type="spellEnd"/>
+      <w:r>
+        <w:t xml:space="preserve"> }</w:t>
+      </w:r>
+      <w:proofErr w:type="gramEnd"/>
+      <w:r>
+        <w:t>} (منفردين او مجتمعين) وذلك في اعتماد وتوثيق عقد وقرار التعديل في هيئة الاستثمار والتوقيع والتصديق في مكتب الشهر العقاري والتعامل مع السجل التجاري والتوقيع على العقد امام الشهر العقاري والغرفة التجارية ومصلحة الضرائب المصرية العامة وجميع الجهات الحكومية وغير الحكومية ولهم حق تفويض وتوكيل الأخرين في كل او بعض ما ذكر.</w:t>
       </w:r>
     </w:p>
     <w:p>
       <w:pPr>
         <w:bidi/>
         <w:spacing w:after="200" w:line="300" w:lineRule="auto"/>
-        <w:jc w:val="both"/>
-      </w:pPr>
-      <w:r>
-        <w:rPr>
-          <w:b/>
-          <w:bCs/>
-        </w:rPr>
-        <w:t>اقر انا {{ owner_name }} بصفتى مالك ومدير شركة {{ company_name }} بصحة ما ورد بهذا الاقرار من بيانات ووقائع وذلك فى مواجهة الهيئة العامة للاستثمار والمناطق الحرة وفى مواجهة الغير، وأقر بالاحتفاظ بجميع المستندات المؤيدة لما ورد فى مقر الشركة واتفاقها مع احكام القانون وعقد الشركة وتعديلاته والالتزام بتقديمها عند طلبها.</w:t>
+      </w:pPr>
+      <w:r>
+        <w:rPr>
+          <w:b/>
+          <w:bCs/>
+        </w:rPr>
+        <w:t xml:space="preserve">اقر انا </w:t>
+      </w:r>
+      <w:proofErr w:type="gramStart"/>
+      <w:r>
+        <w:rPr>
+          <w:b/>
+          <w:bCs/>
+        </w:rPr>
+        <w:t xml:space="preserve">{{ </w:t>
+      </w:r>
+      <w:proofErr w:type="spellStart"/>
+      <w:r>
+        <w:rPr>
+          <w:b/>
+          <w:bCs/>
+        </w:rPr>
+        <w:t>owner</w:t>
+      </w:r>
+      <w:proofErr w:type="gramEnd"/>
+      <w:r>
+        <w:rPr>
+          <w:b/>
+          <w:bCs/>
+        </w:rPr>
+        <w:t>_</w:t>
+      </w:r>
+      <w:proofErr w:type="gramStart"/>
+      <w:r>
+        <w:rPr>
+          <w:b/>
+          <w:bCs/>
+        </w:rPr>
+        <w:t>name</w:t>
+      </w:r>
+      <w:proofErr w:type="spellEnd"/>
+      <w:r>
+        <w:rPr>
+          <w:b/>
+          <w:bCs/>
+        </w:rPr>
+        <w:t xml:space="preserve"> }</w:t>
+      </w:r>
+      <w:proofErr w:type="gramEnd"/>
+      <w:r>
+        <w:rPr>
+          <w:b/>
+          <w:bCs/>
+        </w:rPr>
+        <w:t xml:space="preserve">} </w:t>
+      </w:r>
+      <w:proofErr w:type="spellStart"/>
+      <w:r>
+        <w:rPr>
+          <w:b/>
+          <w:bCs/>
+        </w:rPr>
+        <w:t>بصفتى</w:t>
+      </w:r>
+      <w:proofErr w:type="spellEnd"/>
+      <w:r>
+        <w:rPr>
+          <w:b/>
+          <w:bCs/>
+        </w:rPr>
+        <w:t xml:space="preserve"> مالك ومدير شركة </w:t>
+      </w:r>
+      <w:proofErr w:type="gramStart"/>
+      <w:r>
+        <w:rPr>
+          <w:b/>
+          <w:bCs/>
+        </w:rPr>
+        <w:t xml:space="preserve">{{ </w:t>
+      </w:r>
+      <w:proofErr w:type="spellStart"/>
+      <w:r>
+        <w:rPr>
+          <w:b/>
+          <w:bCs/>
+        </w:rPr>
+        <w:t>company</w:t>
+      </w:r>
+      <w:proofErr w:type="gramEnd"/>
+      <w:r>
+        <w:rPr>
+          <w:b/>
+          <w:bCs/>
+        </w:rPr>
+        <w:t>_</w:t>
+      </w:r>
+      <w:proofErr w:type="gramStart"/>
+      <w:r>
+        <w:rPr>
+          <w:b/>
+          <w:bCs/>
+        </w:rPr>
+        <w:t>name</w:t>
+      </w:r>
+      <w:proofErr w:type="spellEnd"/>
+      <w:r>
+        <w:rPr>
+          <w:b/>
+          <w:bCs/>
+        </w:rPr>
+        <w:t xml:space="preserve"> }</w:t>
+      </w:r>
+      <w:proofErr w:type="gramEnd"/>
+      <w:r>
+        <w:rPr>
+          <w:b/>
+          <w:bCs/>
+        </w:rPr>
+        <w:t xml:space="preserve">} بصحة ما ورد بهذا الاقرار من بيانات ووقائع وذلك </w:t>
+      </w:r>
+      <w:proofErr w:type="spellStart"/>
+      <w:r>
+        <w:rPr>
+          <w:b/>
+          <w:bCs/>
+        </w:rPr>
+        <w:t>فى</w:t>
+      </w:r>
+      <w:proofErr w:type="spellEnd"/>
+      <w:r>
+        <w:rPr>
+          <w:b/>
+          <w:bCs/>
+        </w:rPr>
+        <w:t xml:space="preserve"> مواجهة الهيئة العامة للاستثمار والمناطق الحرة وفى مواجهة الغير، وأقر بالاحتفاظ بجميع المستندات المؤيدة لما ورد </w:t>
+      </w:r>
+      <w:proofErr w:type="spellStart"/>
+      <w:r>
+        <w:rPr>
+          <w:b/>
+          <w:bCs/>
+        </w:rPr>
+        <w:t>فى</w:t>
+      </w:r>
+      <w:proofErr w:type="spellEnd"/>
+      <w:r>
+        <w:rPr>
+          <w:b/>
+          <w:bCs/>
+        </w:rPr>
+        <w:t xml:space="preserve"> مقر الشركة واتفاقها مع احكام القانون وعقد الشركة وتعديلاته والالتزام بتقديمها عند طلبها.</w:t>
       </w:r>
     </w:p>
     <w:p>
@@ -369,6 +1193,7 @@
         <w:spacing w:before="2400"/>
         <w:jc w:val="center"/>
       </w:pPr>
+      <w:proofErr w:type="gramStart"/>
       <w:r>
         <w:rPr>
           <w:b/>
@@ -376,7 +1201,57 @@
           <w:sz w:val="24"/>
           <w:szCs w:val="24"/>
         </w:rPr>
-        <w:t>{{ company_address }}</w:t>
+        <w:t xml:space="preserve">{{ </w:t>
+      </w:r>
+      <w:proofErr w:type="spellStart"/>
+      <w:r>
+        <w:rPr>
+          <w:b/>
+          <w:bCs/>
+          <w:sz w:val="24"/>
+          <w:szCs w:val="24"/>
+        </w:rPr>
+        <w:t>company</w:t>
+      </w:r>
+      <w:proofErr w:type="gramEnd"/>
+      <w:r>
+        <w:rPr>
+          <w:b/>
+          <w:bCs/>
+          <w:sz w:val="24"/>
+          <w:szCs w:val="24"/>
+        </w:rPr>
+        <w:t>_</w:t>
+      </w:r>
+      <w:proofErr w:type="gramStart"/>
+      <w:r>
+        <w:rPr>
+          <w:b/>
+          <w:bCs/>
+          <w:sz w:val="24"/>
+          <w:szCs w:val="24"/>
+        </w:rPr>
+        <w:t>address</w:t>
+      </w:r>
+      <w:proofErr w:type="spellEnd"/>
+      <w:r>
+        <w:rPr>
+          <w:b/>
+          <w:bCs/>
+          <w:sz w:val="24"/>
+          <w:szCs w:val="24"/>
+        </w:rPr>
+        <w:t xml:space="preserve"> }</w:t>
+      </w:r>
+      <w:proofErr w:type="gramEnd"/>
+      <w:r>
+        <w:rPr>
+          <w:b/>
+          <w:bCs/>
+          <w:sz w:val="24"/>
+          <w:szCs w:val="24"/>
+        </w:rPr>
+        <w:t>}</w:t>
       </w:r>
     </w:p>
     <w:sectPr>

</xml_diff>